<commit_message>
Update planning with delivery dates (15 juin – 7 août 2026), remove developer count references
https://claude.ai/code/session_0115Yorzaghts47PGAJs5Vvf
</commit_message>
<xml_diff>
--- a/Bolide_Pro_Planning_8_semaines.docx
+++ b/Bolide_Pro_Planning_8_semaines.docx
@@ -31,13 +31,13 @@
           <w:color w:val="666666"/>
           <w:sz w:val="20"/>
         </w:rPr>
-        <w:t>Cadre : 1 développeur — ordre séquentiel — Gabon / Afrique centrale (XAF)</w:t>
+        <w:t>Démarrage : lundi 15 juin 2026 — Gabon / Afrique centrale (XAF)</w:t>
       </w:r>
     </w:p>
     <w:p/>
     <w:p>
       <w:r>
-        <w:t>Ce planning couvre la finalisation du socle Fleet OS V1.5 (semaines 1 à 2) puis le développement complet de la couche Bolide Pro (semaines 3 à 7). La huitième et dernière semaine est entièrement consacrée aux tests et corrections avant mise en production. Le développement est réalisé par un seul développeur, en séquentiel.</w:t>
+        <w:t>Ce planning couvre la finalisation du socle Fleet OS V1.5 (semaines 1 à 2) puis le développement complet de la couche Bolide Pro (semaines 3 à 7). La huitième et dernière semaine est entièrement consacrée aux tests et corrections avant mise en production.</w:t>
       </w:r>
     </w:p>
     <w:p>
@@ -61,14 +61,15 @@
         <w:tblLook w:firstColumn="1" w:firstRow="1" w:lastColumn="0" w:lastRow="0" w:noHBand="0" w:noVBand="1" w:val="04A0"/>
       </w:tblPr>
       <w:tblGrid>
-        <w:gridCol w:w="2880"/>
-        <w:gridCol w:w="2880"/>
-        <w:gridCol w:w="2880"/>
+        <w:gridCol w:w="2160"/>
+        <w:gridCol w:w="2160"/>
+        <w:gridCol w:w="2160"/>
+        <w:gridCol w:w="2160"/>
       </w:tblGrid>
       <w:tr>
         <w:tc>
           <w:tcPr>
-            <w:tcW w:type="dxa" w:w="1008"/>
+            <w:tcW w:type="dxa" w:w="864"/>
             <w:shd w:val="clear" w:color="auto" w:fill="1F4E9C"/>
           </w:tcPr>
           <w:p>
@@ -85,7 +86,24 @@
         </w:tc>
         <w:tc>
           <w:tcPr>
-            <w:tcW w:type="dxa" w:w="1872"/>
+            <w:tcW w:type="dxa" w:w="2160"/>
+            <w:shd w:val="clear" w:color="auto" w:fill="1F4E9C"/>
+          </w:tcPr>
+          <w:p>
+            <w:r/>
+            <w:r>
+              <w:rPr>
+                <w:b/>
+                <w:color w:val="FFFFFF"/>
+                <w:sz w:val="21"/>
+              </w:rPr>
+              <w:t>Dates</w:t>
+            </w:r>
+          </w:p>
+        </w:tc>
+        <w:tc>
+          <w:tcPr>
+            <w:tcW w:type="dxa" w:w="1584"/>
             <w:shd w:val="clear" w:color="auto" w:fill="1F4E9C"/>
           </w:tcPr>
           <w:p>
@@ -102,7 +120,7 @@
         </w:tc>
         <w:tc>
           <w:tcPr>
-            <w:tcW w:type="dxa" w:w="6480"/>
+            <w:tcW w:type="dxa" w:w="5472"/>
             <w:shd w:val="clear" w:color="auto" w:fill="1F4E9C"/>
           </w:tcPr>
           <w:p>
@@ -121,7 +139,7 @@
       <w:tr>
         <w:tc>
           <w:tcPr>
-            <w:tcW w:type="dxa" w:w="1008"/>
+            <w:tcW w:type="dxa" w:w="864"/>
           </w:tcPr>
           <w:p>
             <w:r/>
@@ -137,7 +155,23 @@
         </w:tc>
         <w:tc>
           <w:tcPr>
-            <w:tcW w:type="dxa" w:w="1872"/>
+            <w:tcW w:type="dxa" w:w="2160"/>
+          </w:tcPr>
+          <w:p>
+            <w:r/>
+            <w:r>
+              <w:rPr>
+                <w:b/>
+                <w:color w:val="1F4E9C"/>
+                <w:sz w:val="20"/>
+              </w:rPr>
+              <w:t>15 – 19 juin 2026</w:t>
+            </w:r>
+          </w:p>
+        </w:tc>
+        <w:tc>
+          <w:tcPr>
+            <w:tcW w:type="dxa" w:w="1584"/>
           </w:tcPr>
           <w:p>
             <w:r/>
@@ -153,7 +187,7 @@
         </w:tc>
         <w:tc>
           <w:tcPr>
-            <w:tcW w:type="dxa" w:w="6480"/>
+            <w:tcW w:type="dxa" w:w="5472"/>
           </w:tcPr>
           <w:p>
             <w:r/>
@@ -171,7 +205,7 @@
       <w:tr>
         <w:tc>
           <w:tcPr>
-            <w:tcW w:type="dxa" w:w="1008"/>
+            <w:tcW w:type="dxa" w:w="864"/>
             <w:shd w:val="clear" w:color="auto" w:fill="EEF2FA"/>
           </w:tcPr>
           <w:p>
@@ -188,7 +222,24 @@
         </w:tc>
         <w:tc>
           <w:tcPr>
-            <w:tcW w:type="dxa" w:w="1872"/>
+            <w:tcW w:type="dxa" w:w="2160"/>
+            <w:shd w:val="clear" w:color="auto" w:fill="EEF2FA"/>
+          </w:tcPr>
+          <w:p>
+            <w:r/>
+            <w:r>
+              <w:rPr>
+                <w:b/>
+                <w:color w:val="1F4E9C"/>
+                <w:sz w:val="20"/>
+              </w:rPr>
+              <w:t>22 – 26 juin 2026</w:t>
+            </w:r>
+          </w:p>
+        </w:tc>
+        <w:tc>
+          <w:tcPr>
+            <w:tcW w:type="dxa" w:w="1584"/>
             <w:shd w:val="clear" w:color="auto" w:fill="EEF2FA"/>
           </w:tcPr>
           <w:p>
@@ -205,7 +256,7 @@
         </w:tc>
         <w:tc>
           <w:tcPr>
-            <w:tcW w:type="dxa" w:w="6480"/>
+            <w:tcW w:type="dxa" w:w="5472"/>
             <w:shd w:val="clear" w:color="auto" w:fill="EEF2FA"/>
           </w:tcPr>
           <w:p>
@@ -224,7 +275,7 @@
       <w:tr>
         <w:tc>
           <w:tcPr>
-            <w:tcW w:type="dxa" w:w="1008"/>
+            <w:tcW w:type="dxa" w:w="864"/>
           </w:tcPr>
           <w:p>
             <w:r/>
@@ -240,7 +291,23 @@
         </w:tc>
         <w:tc>
           <w:tcPr>
-            <w:tcW w:type="dxa" w:w="1872"/>
+            <w:tcW w:type="dxa" w:w="2160"/>
+          </w:tcPr>
+          <w:p>
+            <w:r/>
+            <w:r>
+              <w:rPr>
+                <w:b/>
+                <w:color w:val="1F4E9C"/>
+                <w:sz w:val="20"/>
+              </w:rPr>
+              <w:t>29 juin – 3 juil. 2026</w:t>
+            </w:r>
+          </w:p>
+        </w:tc>
+        <w:tc>
+          <w:tcPr>
+            <w:tcW w:type="dxa" w:w="1584"/>
           </w:tcPr>
           <w:p>
             <w:r/>
@@ -256,7 +323,7 @@
         </w:tc>
         <w:tc>
           <w:tcPr>
-            <w:tcW w:type="dxa" w:w="6480"/>
+            <w:tcW w:type="dxa" w:w="5472"/>
           </w:tcPr>
           <w:p>
             <w:r/>
@@ -274,7 +341,7 @@
       <w:tr>
         <w:tc>
           <w:tcPr>
-            <w:tcW w:type="dxa" w:w="1008"/>
+            <w:tcW w:type="dxa" w:w="864"/>
             <w:shd w:val="clear" w:color="auto" w:fill="EEF2FA"/>
           </w:tcPr>
           <w:p>
@@ -291,7 +358,24 @@
         </w:tc>
         <w:tc>
           <w:tcPr>
-            <w:tcW w:type="dxa" w:w="1872"/>
+            <w:tcW w:type="dxa" w:w="2160"/>
+            <w:shd w:val="clear" w:color="auto" w:fill="EEF2FA"/>
+          </w:tcPr>
+          <w:p>
+            <w:r/>
+            <w:r>
+              <w:rPr>
+                <w:b/>
+                <w:color w:val="1F4E9C"/>
+                <w:sz w:val="20"/>
+              </w:rPr>
+              <w:t>6 – 10 juil. 2026</w:t>
+            </w:r>
+          </w:p>
+        </w:tc>
+        <w:tc>
+          <w:tcPr>
+            <w:tcW w:type="dxa" w:w="1584"/>
             <w:shd w:val="clear" w:color="auto" w:fill="EEF2FA"/>
           </w:tcPr>
           <w:p>
@@ -308,7 +392,7 @@
         </w:tc>
         <w:tc>
           <w:tcPr>
-            <w:tcW w:type="dxa" w:w="6480"/>
+            <w:tcW w:type="dxa" w:w="5472"/>
             <w:shd w:val="clear" w:color="auto" w:fill="EEF2FA"/>
           </w:tcPr>
           <w:p>
@@ -327,7 +411,7 @@
       <w:tr>
         <w:tc>
           <w:tcPr>
-            <w:tcW w:type="dxa" w:w="1008"/>
+            <w:tcW w:type="dxa" w:w="864"/>
           </w:tcPr>
           <w:p>
             <w:r/>
@@ -343,7 +427,23 @@
         </w:tc>
         <w:tc>
           <w:tcPr>
-            <w:tcW w:type="dxa" w:w="1872"/>
+            <w:tcW w:type="dxa" w:w="2160"/>
+          </w:tcPr>
+          <w:p>
+            <w:r/>
+            <w:r>
+              <w:rPr>
+                <w:b/>
+                <w:color w:val="1F4E9C"/>
+                <w:sz w:val="20"/>
+              </w:rPr>
+              <w:t>13 – 17 juil. 2026</w:t>
+            </w:r>
+          </w:p>
+        </w:tc>
+        <w:tc>
+          <w:tcPr>
+            <w:tcW w:type="dxa" w:w="1584"/>
           </w:tcPr>
           <w:p>
             <w:r/>
@@ -359,7 +459,7 @@
         </w:tc>
         <w:tc>
           <w:tcPr>
-            <w:tcW w:type="dxa" w:w="6480"/>
+            <w:tcW w:type="dxa" w:w="5472"/>
           </w:tcPr>
           <w:p>
             <w:r/>
@@ -377,7 +477,7 @@
       <w:tr>
         <w:tc>
           <w:tcPr>
-            <w:tcW w:type="dxa" w:w="1008"/>
+            <w:tcW w:type="dxa" w:w="864"/>
             <w:shd w:val="clear" w:color="auto" w:fill="EEF2FA"/>
           </w:tcPr>
           <w:p>
@@ -394,7 +494,24 @@
         </w:tc>
         <w:tc>
           <w:tcPr>
-            <w:tcW w:type="dxa" w:w="1872"/>
+            <w:tcW w:type="dxa" w:w="2160"/>
+            <w:shd w:val="clear" w:color="auto" w:fill="EEF2FA"/>
+          </w:tcPr>
+          <w:p>
+            <w:r/>
+            <w:r>
+              <w:rPr>
+                <w:b/>
+                <w:color w:val="1F4E9C"/>
+                <w:sz w:val="20"/>
+              </w:rPr>
+              <w:t>20 – 24 juil. 2026</w:t>
+            </w:r>
+          </w:p>
+        </w:tc>
+        <w:tc>
+          <w:tcPr>
+            <w:tcW w:type="dxa" w:w="1584"/>
             <w:shd w:val="clear" w:color="auto" w:fill="EEF2FA"/>
           </w:tcPr>
           <w:p>
@@ -411,7 +528,7 @@
         </w:tc>
         <w:tc>
           <w:tcPr>
-            <w:tcW w:type="dxa" w:w="6480"/>
+            <w:tcW w:type="dxa" w:w="5472"/>
             <w:shd w:val="clear" w:color="auto" w:fill="EEF2FA"/>
           </w:tcPr>
           <w:p>
@@ -430,7 +547,7 @@
       <w:tr>
         <w:tc>
           <w:tcPr>
-            <w:tcW w:type="dxa" w:w="1008"/>
+            <w:tcW w:type="dxa" w:w="864"/>
           </w:tcPr>
           <w:p>
             <w:r/>
@@ -446,7 +563,23 @@
         </w:tc>
         <w:tc>
           <w:tcPr>
-            <w:tcW w:type="dxa" w:w="1872"/>
+            <w:tcW w:type="dxa" w:w="2160"/>
+          </w:tcPr>
+          <w:p>
+            <w:r/>
+            <w:r>
+              <w:rPr>
+                <w:b/>
+                <w:color w:val="1F4E9C"/>
+                <w:sz w:val="20"/>
+              </w:rPr>
+              <w:t>27 – 31 juil. 2026</w:t>
+            </w:r>
+          </w:p>
+        </w:tc>
+        <w:tc>
+          <w:tcPr>
+            <w:tcW w:type="dxa" w:w="1584"/>
           </w:tcPr>
           <w:p>
             <w:r/>
@@ -462,7 +595,7 @@
         </w:tc>
         <w:tc>
           <w:tcPr>
-            <w:tcW w:type="dxa" w:w="6480"/>
+            <w:tcW w:type="dxa" w:w="5472"/>
           </w:tcPr>
           <w:p>
             <w:r/>
@@ -480,7 +613,7 @@
       <w:tr>
         <w:tc>
           <w:tcPr>
-            <w:tcW w:type="dxa" w:w="1008"/>
+            <w:tcW w:type="dxa" w:w="864"/>
             <w:shd w:val="clear" w:color="auto" w:fill="EEF2FA"/>
             <w:shd w:val="clear" w:color="auto" w:fill="FBEAEA"/>
           </w:tcPr>
@@ -498,7 +631,25 @@
         </w:tc>
         <w:tc>
           <w:tcPr>
-            <w:tcW w:type="dxa" w:w="1872"/>
+            <w:tcW w:type="dxa" w:w="2160"/>
+            <w:shd w:val="clear" w:color="auto" w:fill="EEF2FA"/>
+            <w:shd w:val="clear" w:color="auto" w:fill="FBEAEA"/>
+          </w:tcPr>
+          <w:p>
+            <w:r/>
+            <w:r>
+              <w:rPr>
+                <w:b/>
+                <w:color w:val="1F4E9C"/>
+                <w:sz w:val="20"/>
+              </w:rPr>
+              <w:t>3 – 7 août 2026</w:t>
+            </w:r>
+          </w:p>
+        </w:tc>
+        <w:tc>
+          <w:tcPr>
+            <w:tcW w:type="dxa" w:w="1584"/>
             <w:shd w:val="clear" w:color="auto" w:fill="EEF2FA"/>
             <w:shd w:val="clear" w:color="auto" w:fill="FBEAEA"/>
           </w:tcPr>
@@ -516,7 +667,7 @@
         </w:tc>
         <w:tc>
           <w:tcPr>
-            <w:tcW w:type="dxa" w:w="6480"/>
+            <w:tcW w:type="dxa" w:w="5472"/>
             <w:shd w:val="clear" w:color="auto" w:fill="EEF2FA"/>
             <w:shd w:val="clear" w:color="auto" w:fill="FBEAEA"/>
           </w:tcPr>
@@ -547,7 +698,7 @@
         <w:rPr>
           <w:sz w:val="20"/>
         </w:rPr>
-        <w:t>le développement est strictement séquentiel. Fleet OS V1.5 (S1–S2) fournit le socle (véhicules, incidents) réutilisé par Bolide Pro. Au sein de Bolide Pro, chaque semaine s'appuie sur la précédente : les affectations (S3) conditionnent la validation (S4), qui conditionne le salaire (S5), lui-même agrégé dans les tableaux de bord (S6).</w:t>
+        <w:t>Fleet OS V1.5 (S1–S2) fournit le socle (véhicules, incidents) réutilisé par Bolide Pro. Au sein de Bolide Pro, chaque semaine s'appuie sur la précédente : les affectations (S3) conditionnent la validation (S4), qui conditionne le salaire (S5), lui-même agrégé dans les tableaux de bord (S6). Mise en production prévue : lundi 10 août 2026.</w:t>
       </w:r>
     </w:p>
     <w:p>
@@ -586,7 +737,7 @@
           <w:color w:val="1F4E9C"/>
           <w:sz w:val="24"/>
         </w:rPr>
-        <w:t>S1 — Fleet OS V1.5 : Véhicules &amp; Affectations [4.7]</w:t>
+        <w:t>S1 — 15 au 19 juin 2026 — Fleet OS V1.5 : Véhicules &amp; Affectations [4.7]</w:t>
       </w:r>
     </w:p>
     <w:p>
@@ -659,7 +810,7 @@
           <w:color w:val="1F4E9C"/>
           <w:sz w:val="24"/>
         </w:rPr>
-        <w:t>S2 — Fleet OS V1.5 : Incidents, Dépenses, Automatismes [4.8 / 9.3]</w:t>
+        <w:t>S2 — 22 au 26 juin 2026 — Fleet OS V1.5 : Incidents, Dépenses, Automatismes [4.8 / 9.3]</w:t>
       </w:r>
     </w:p>
     <w:p>
@@ -720,7 +871,7 @@
           <w:color w:val="1F4E9C"/>
           <w:sz w:val="24"/>
         </w:rPr>
-        <w:t>S3 — Bolide Pro : Affectations dédiées [5.1]</w:t>
+        <w:t>S3 — 29 juin au 3 juillet 2026 — Bolide Pro : Affectations dédiées [5.1]</w:t>
       </w:r>
     </w:p>
     <w:p>
@@ -805,7 +956,7 @@
           <w:color w:val="1F4E9C"/>
           <w:sz w:val="24"/>
         </w:rPr>
-        <w:t>S4 — Bolide Pro : Validation journalière [5.2]</w:t>
+        <w:t>S4 — 6 au 10 juillet 2026 — Bolide Pro : Validation journalière [5.2]</w:t>
       </w:r>
     </w:p>
     <w:p>
@@ -890,7 +1041,7 @@
           <w:color w:val="1F4E9C"/>
           <w:sz w:val="24"/>
         </w:rPr>
-        <w:t>S5 — Bolide Pro : Heures supplémentaires &amp; Salaire [5.3 / 5.4]</w:t>
+        <w:t>S5 — 13 au 17 juillet 2026 — Bolide Pro : Heures supplémentaires &amp; Salaire [5.3 / 5.4]</w:t>
       </w:r>
     </w:p>
     <w:p>
@@ -975,7 +1126,7 @@
           <w:color w:val="1F4E9C"/>
           <w:sz w:val="24"/>
         </w:rPr>
-        <w:t>S6 — Bolide Pro : Dashboard manager Pro [5.5]</w:t>
+        <w:t>S6 — 20 au 24 juillet 2026 — Bolide Pro : Dashboard manager Pro [5.5]</w:t>
       </w:r>
     </w:p>
     <w:p>
@@ -1024,7 +1175,7 @@
           <w:color w:val="1F4E9C"/>
           <w:sz w:val="24"/>
         </w:rPr>
-        <w:t>S7 — Bolide Pro : Interface Driver &amp; Notation [5.6 / 5.7]</w:t>
+        <w:t>S7 — 27 au 31 juillet 2026 — Bolide Pro : Interface Driver &amp; Notation [5.6 / 5.7]</w:t>
       </w:r>
     </w:p>
     <w:p>
@@ -1097,7 +1248,7 @@
           <w:color w:val="1F4E9C"/>
           <w:sz w:val="24"/>
         </w:rPr>
-        <w:t>S8 — Tests &amp; corrections [12]</w:t>
+        <w:t>S8 — 3 au 7 août 2026 — Tests &amp; corrections [12]</w:t>
       </w:r>
     </w:p>
     <w:p>

</xml_diff>

<commit_message>
Split planning into two standalone docs (overview + technical detail), highlight S1/S2 rows in red
https://claude.ai/code/session_0115Yorzaghts47PGAJs5Vvf
</commit_message>
<xml_diff>
--- a/Bolide_Pro_Planning_8_semaines.docx
+++ b/Bolide_Pro_Planning_8_semaines.docx
@@ -36,11 +36,6 @@
     </w:p>
     <w:p/>
     <w:p>
-      <w:r>
-        <w:t>Ce planning couvre la finalisation du socle Fleet OS V1.5 (semaines 1 à 2) puis le développement complet de la couche Bolide Pro (semaines 3 à 7). La huitième et dernière semaine est entièrement consacrée aux tests et corrections avant mise en production.</w:t>
-      </w:r>
-    </w:p>
-    <w:p>
       <w:pPr>
         <w:spacing w:before="280" w:after="120"/>
       </w:pPr>
@@ -51,6 +46,11 @@
           <w:sz w:val="32"/>
         </w:rPr>
         <w:t>1. Vue d'ensemble du planning</w:t>
+      </w:r>
+    </w:p>
+    <w:p>
+      <w:r>
+        <w:t>Ce planning couvre la finalisation du socle Fleet OS V1.5 (semaines 1 à 2) puis le développement complet de la couche Bolide Pro (semaines 3 à 7). La huitième et dernière semaine est entièrement consacrée aux tests et corrections avant mise en production.</w:t>
       </w:r>
     </w:p>
     <w:tbl>
@@ -140,6 +140,7 @@
         <w:tc>
           <w:tcPr>
             <w:tcW w:type="dxa" w:w="864"/>
+            <w:shd w:val="clear" w:color="auto" w:fill="FBEAEA"/>
           </w:tcPr>
           <w:p>
             <w:r/>
@@ -156,6 +157,7 @@
         <w:tc>
           <w:tcPr>
             <w:tcW w:type="dxa" w:w="2160"/>
+            <w:shd w:val="clear" w:color="auto" w:fill="FBEAEA"/>
           </w:tcPr>
           <w:p>
             <w:r/>
@@ -172,6 +174,7 @@
         <w:tc>
           <w:tcPr>
             <w:tcW w:type="dxa" w:w="1584"/>
+            <w:shd w:val="clear" w:color="auto" w:fill="FBEAEA"/>
           </w:tcPr>
           <w:p>
             <w:r/>
@@ -188,6 +191,7 @@
         <w:tc>
           <w:tcPr>
             <w:tcW w:type="dxa" w:w="5472"/>
+            <w:shd w:val="clear" w:color="auto" w:fill="FBEAEA"/>
           </w:tcPr>
           <w:p>
             <w:r/>
@@ -206,7 +210,7 @@
         <w:tc>
           <w:tcPr>
             <w:tcW w:type="dxa" w:w="864"/>
-            <w:shd w:val="clear" w:color="auto" w:fill="EEF2FA"/>
+            <w:shd w:val="clear" w:color="auto" w:fill="FBEAEA"/>
           </w:tcPr>
           <w:p>
             <w:r/>
@@ -223,7 +227,7 @@
         <w:tc>
           <w:tcPr>
             <w:tcW w:type="dxa" w:w="2160"/>
-            <w:shd w:val="clear" w:color="auto" w:fill="EEF2FA"/>
+            <w:shd w:val="clear" w:color="auto" w:fill="FBEAEA"/>
           </w:tcPr>
           <w:p>
             <w:r/>
@@ -240,7 +244,7 @@
         <w:tc>
           <w:tcPr>
             <w:tcW w:type="dxa" w:w="1584"/>
-            <w:shd w:val="clear" w:color="auto" w:fill="EEF2FA"/>
+            <w:shd w:val="clear" w:color="auto" w:fill="FBEAEA"/>
           </w:tcPr>
           <w:p>
             <w:r/>
@@ -257,7 +261,7 @@
         <w:tc>
           <w:tcPr>
             <w:tcW w:type="dxa" w:w="5472"/>
-            <w:shd w:val="clear" w:color="auto" w:fill="EEF2FA"/>
+            <w:shd w:val="clear" w:color="auto" w:fill="FBEAEA"/>
           </w:tcPr>
           <w:p>
             <w:r/>
@@ -614,7 +618,6 @@
         <w:tc>
           <w:tcPr>
             <w:tcW w:type="dxa" w:w="864"/>
-            <w:shd w:val="clear" w:color="auto" w:fill="EEF2FA"/>
             <w:shd w:val="clear" w:color="auto" w:fill="FBEAEA"/>
           </w:tcPr>
           <w:p>
@@ -632,7 +635,6 @@
         <w:tc>
           <w:tcPr>
             <w:tcW w:type="dxa" w:w="2160"/>
-            <w:shd w:val="clear" w:color="auto" w:fill="EEF2FA"/>
             <w:shd w:val="clear" w:color="auto" w:fill="FBEAEA"/>
           </w:tcPr>
           <w:p>
@@ -650,7 +652,6 @@
         <w:tc>
           <w:tcPr>
             <w:tcW w:type="dxa" w:w="1584"/>
-            <w:shd w:val="clear" w:color="auto" w:fill="EEF2FA"/>
             <w:shd w:val="clear" w:color="auto" w:fill="FBEAEA"/>
           </w:tcPr>
           <w:p>
@@ -668,7 +669,6 @@
         <w:tc>
           <w:tcPr>
             <w:tcW w:type="dxa" w:w="5472"/>
-            <w:shd w:val="clear" w:color="auto" w:fill="EEF2FA"/>
             <w:shd w:val="clear" w:color="auto" w:fill="FBEAEA"/>
           </w:tcPr>
           <w:p>

</xml_diff>